<commit_message>
feat: Implement grievance ID allocation system with database support and update related configurations
</commit_message>
<xml_diff>
--- a/Docx Files Template/statement_of_occurrence fixed.docx
+++ b/Docx Files Template/statement_of_occurrence fixed.docx
@@ -356,6 +356,7 @@
           </w:placeholder>
           <w:text/>
         </w:sdtPr>
+        <w:sdtEndPr/>
         <w:sdtContent>
           <w:r>
             <w:rPr>
@@ -364,7 +365,27 @@
               <w:szCs w:val="16"/>
               <w:u w:val="single"/>
             </w:rPr>
-            <w:t>{{ grievant_name }}</w:t>
+            <w:t xml:space="preserve">{{ </w:t>
+          </w:r>
+          <w:proofErr w:type="spellStart"/>
+          <w:r>
+            <w:rPr>
+              <w:rFonts w:ascii="Arial" w:hAnsi="Arial" w:cs="Arial"/>
+              <w:sz w:val="16"/>
+              <w:szCs w:val="16"/>
+              <w:u w:val="single"/>
+            </w:rPr>
+            <w:t>grievant_name</w:t>
+          </w:r>
+          <w:proofErr w:type="spellEnd"/>
+          <w:r>
+            <w:rPr>
+              <w:rFonts w:ascii="Arial" w:hAnsi="Arial" w:cs="Arial"/>
+              <w:sz w:val="16"/>
+              <w:szCs w:val="16"/>
+              <w:u w:val="single"/>
+            </w:rPr>
+            <w:t xml:space="preserve"> }}</w:t>
           </w:r>
         </w:sdtContent>
       </w:sdt>
@@ -440,6 +461,7 @@
           </w:placeholder>
           <w:text/>
         </w:sdtPr>
+        <w:sdtEndPr/>
         <w:sdtContent>
           <w:r>
             <w:rPr>
@@ -448,7 +470,27 @@
               <w:szCs w:val="16"/>
               <w:u w:val="single"/>
             </w:rPr>
-            <w:t>{{ work_address }}</w:t>
+            <w:t xml:space="preserve">{{ </w:t>
+          </w:r>
+          <w:proofErr w:type="spellStart"/>
+          <w:r>
+            <w:rPr>
+              <w:rFonts w:ascii="Arial" w:hAnsi="Arial" w:cs="Arial"/>
+              <w:sz w:val="16"/>
+              <w:szCs w:val="16"/>
+              <w:u w:val="single"/>
+            </w:rPr>
+            <w:t>work_address</w:t>
+          </w:r>
+          <w:proofErr w:type="spellEnd"/>
+          <w:r>
+            <w:rPr>
+              <w:rFonts w:ascii="Arial" w:hAnsi="Arial" w:cs="Arial"/>
+              <w:sz w:val="16"/>
+              <w:szCs w:val="16"/>
+              <w:u w:val="single"/>
+            </w:rPr>
+            <w:t xml:space="preserve"> }}</w:t>
           </w:r>
         </w:sdtContent>
       </w:sdt>
@@ -586,6 +628,7 @@
           </w:placeholder>
           <w:text/>
         </w:sdtPr>
+        <w:sdtEndPr/>
         <w:sdtContent>
           <w:r>
             <w:rPr>
@@ -594,7 +637,27 @@
               <w:szCs w:val="16"/>
               <w:u w:val="single"/>
             </w:rPr>
-            <w:t>{{ home_address }}</w:t>
+            <w:t xml:space="preserve">{{ </w:t>
+          </w:r>
+          <w:proofErr w:type="spellStart"/>
+          <w:r>
+            <w:rPr>
+              <w:rFonts w:ascii="Arial" w:hAnsi="Arial" w:cs="Arial"/>
+              <w:sz w:val="16"/>
+              <w:szCs w:val="16"/>
+              <w:u w:val="single"/>
+            </w:rPr>
+            <w:t>home_address</w:t>
+          </w:r>
+          <w:proofErr w:type="spellEnd"/>
+          <w:r>
+            <w:rPr>
+              <w:rFonts w:ascii="Arial" w:hAnsi="Arial" w:cs="Arial"/>
+              <w:sz w:val="16"/>
+              <w:szCs w:val="16"/>
+              <w:u w:val="single"/>
+            </w:rPr>
+            <w:t xml:space="preserve"> }}</w:t>
           </w:r>
         </w:sdtContent>
       </w:sdt>
@@ -760,6 +823,7 @@
           </w:placeholder>
           <w:text/>
         </w:sdtPr>
+        <w:sdtEndPr/>
         <w:sdtContent>
           <w:r>
             <w:rPr>
@@ -768,7 +832,27 @@
               <w:szCs w:val="16"/>
               <w:u w:val="single"/>
             </w:rPr>
-            <w:t>{{ seniority_date }}</w:t>
+            <w:t xml:space="preserve">{{ </w:t>
+          </w:r>
+          <w:proofErr w:type="spellStart"/>
+          <w:r>
+            <w:rPr>
+              <w:rFonts w:ascii="Arial" w:hAnsi="Arial" w:cs="Arial"/>
+              <w:sz w:val="16"/>
+              <w:szCs w:val="16"/>
+              <w:u w:val="single"/>
+            </w:rPr>
+            <w:t>seniority_date</w:t>
+          </w:r>
+          <w:proofErr w:type="spellEnd"/>
+          <w:r>
+            <w:rPr>
+              <w:rFonts w:ascii="Arial" w:hAnsi="Arial" w:cs="Arial"/>
+              <w:sz w:val="16"/>
+              <w:szCs w:val="16"/>
+              <w:u w:val="single"/>
+            </w:rPr>
+            <w:t xml:space="preserve"> }}</w:t>
           </w:r>
         </w:sdtContent>
       </w:sdt>
@@ -821,6 +905,7 @@
           </w:placeholder>
           <w:text/>
         </w:sdtPr>
+        <w:sdtEndPr/>
         <w:sdtContent>
           <w:r>
             <w:rPr>
@@ -829,7 +914,27 @@
               <w:szCs w:val="16"/>
               <w:u w:val="single"/>
             </w:rPr>
-            <w:t>{{ ncs_date }}</w:t>
+            <w:t xml:space="preserve">{{ </w:t>
+          </w:r>
+          <w:proofErr w:type="spellStart"/>
+          <w:r>
+            <w:rPr>
+              <w:rFonts w:ascii="Arial" w:hAnsi="Arial" w:cs="Arial"/>
+              <w:sz w:val="16"/>
+              <w:szCs w:val="16"/>
+              <w:u w:val="single"/>
+            </w:rPr>
+            <w:t>ncs_date</w:t>
+          </w:r>
+          <w:proofErr w:type="spellEnd"/>
+          <w:r>
+            <w:rPr>
+              <w:rFonts w:ascii="Arial" w:hAnsi="Arial" w:cs="Arial"/>
+              <w:sz w:val="16"/>
+              <w:szCs w:val="16"/>
+              <w:u w:val="single"/>
+            </w:rPr>
+            <w:t xml:space="preserve"> }}</w:t>
           </w:r>
         </w:sdtContent>
       </w:sdt>
@@ -898,6 +1003,7 @@
           </w:placeholder>
           <w:text/>
         </w:sdtPr>
+        <w:sdtEndPr/>
         <w:sdtContent>
           <w:r>
             <w:rPr>
@@ -906,7 +1012,27 @@
               <w:szCs w:val="16"/>
               <w:u w:val="single"/>
             </w:rPr>
-            <w:t>{{ personal_cell }}</w:t>
+            <w:t xml:space="preserve">{{ </w:t>
+          </w:r>
+          <w:proofErr w:type="spellStart"/>
+          <w:r>
+            <w:rPr>
+              <w:rFonts w:ascii="Arial" w:hAnsi="Arial" w:cs="Arial"/>
+              <w:sz w:val="16"/>
+              <w:szCs w:val="16"/>
+              <w:u w:val="single"/>
+            </w:rPr>
+            <w:t>personal_cell</w:t>
+          </w:r>
+          <w:proofErr w:type="spellEnd"/>
+          <w:r>
+            <w:rPr>
+              <w:rFonts w:ascii="Arial" w:hAnsi="Arial" w:cs="Arial"/>
+              <w:sz w:val="16"/>
+              <w:szCs w:val="16"/>
+              <w:u w:val="single"/>
+            </w:rPr>
+            <w:t xml:space="preserve"> }}</w:t>
           </w:r>
         </w:sdtContent>
       </w:sdt>
@@ -960,9 +1086,18 @@
           </w:placeholder>
           <w:text/>
         </w:sdtPr>
+        <w:sdtEndPr/>
         <w:sdtContent>
           <w:r>
-            <w:t>{{ personal_email }}</w:t>
+            <w:t xml:space="preserve">{{ </w:t>
+          </w:r>
+          <w:proofErr w:type="spellStart"/>
+          <w:r>
+            <w:t>personal_email</w:t>
+          </w:r>
+          <w:proofErr w:type="spellEnd"/>
+          <w:r>
+            <w:t xml:space="preserve"> }}</w:t>
           </w:r>
         </w:sdtContent>
       </w:sdt>
@@ -1030,6 +1165,7 @@
           </w:placeholder>
           <w:text/>
         </w:sdtPr>
+        <w:sdtEndPr/>
         <w:sdtContent>
           <w:r>
             <w:rPr>
@@ -1088,6 +1224,7 @@
           </w:placeholder>
           <w:text/>
         </w:sdtPr>
+        <w:sdtEndPr/>
         <w:sdtContent>
           <w:r>
             <w:t>{{ title }}</w:t>
@@ -1113,7 +1250,7 @@
           <w:tab w:val="left" w:pos="6750"/>
           <w:tab w:val="left" w:pos="10980"/>
         </w:tabs>
-        <w:spacing w:after="360" w:line="240" w:lineRule="auto"/>
+        <w:spacing w:after="220" w:line="240" w:lineRule="auto"/>
         <w:ind w:left="0" w:right="0"/>
         <w:rPr>
           <w:szCs w:val="16"/>
@@ -1159,6 +1296,7 @@
           </w:placeholder>
           <w:text/>
         </w:sdtPr>
+        <w:sdtEndPr/>
         <w:sdtContent>
           <w:r>
             <w:rPr>
@@ -1167,7 +1305,27 @@
               <w:szCs w:val="16"/>
               <w:u w:val="single"/>
             </w:rPr>
-            <w:t>{{ supervisor_name }}</w:t>
+            <w:t xml:space="preserve">{{ </w:t>
+          </w:r>
+          <w:proofErr w:type="spellStart"/>
+          <w:r>
+            <w:rPr>
+              <w:rFonts w:ascii="Arial" w:hAnsi="Arial" w:cs="Arial"/>
+              <w:sz w:val="16"/>
+              <w:szCs w:val="16"/>
+              <w:u w:val="single"/>
+            </w:rPr>
+            <w:t>supervisor_name</w:t>
+          </w:r>
+          <w:proofErr w:type="spellEnd"/>
+          <w:r>
+            <w:rPr>
+              <w:rFonts w:ascii="Arial" w:hAnsi="Arial" w:cs="Arial"/>
+              <w:sz w:val="16"/>
+              <w:szCs w:val="16"/>
+              <w:u w:val="single"/>
+            </w:rPr>
+            <w:t xml:space="preserve"> }}</w:t>
           </w:r>
         </w:sdtContent>
       </w:sdt>
@@ -1224,9 +1382,18 @@
           </w:placeholder>
           <w:text/>
         </w:sdtPr>
+        <w:sdtEndPr/>
         <w:sdtContent>
           <w:r>
-            <w:t>{{ supervisor_phone }}</w:t>
+            <w:t xml:space="preserve">{{ </w:t>
+          </w:r>
+          <w:proofErr w:type="spellStart"/>
+          <w:r>
+            <w:t>supervisor_phone</w:t>
+          </w:r>
+          <w:proofErr w:type="spellEnd"/>
+          <w:r>
+            <w:t xml:space="preserve"> }}</w:t>
           </w:r>
         </w:sdtContent>
       </w:sdt>
@@ -1234,6 +1401,226 @@
         <w:rPr>
           <w:szCs w:val="16"/>
           <w:u w:val="single"/>
+        </w:rPr>
+        <w:tab/>
+      </w:r>
+    </w:p>
+    <w:p>
+      <w:pPr>
+        <w:tabs>
+          <w:tab w:val="left" w:pos="1800"/>
+          <w:tab w:val="left" w:pos="5670"/>
+          <w:tab w:val="left" w:pos="5760"/>
+          <w:tab w:val="left" w:pos="6750"/>
+          <w:tab w:val="left" w:pos="10980"/>
+        </w:tabs>
+        <w:spacing w:after="360" w:line="240" w:lineRule="auto"/>
+        <w:ind w:left="0" w:right="0"/>
+        <w:rPr>
+          <w:szCs w:val="16"/>
+          <w:u w:val="single"/>
+        </w:rPr>
+      </w:pPr>
+      <w:r>
+        <w:rPr>
+          <w:rFonts w:ascii="Arial" w:hAnsi="Arial" w:cs="Arial"/>
+          <w:sz w:val="16"/>
+          <w:szCs w:val="16"/>
+        </w:rPr>
+        <w:t xml:space="preserve">SUPERVISOR’S </w:t>
+      </w:r>
+      <w:r>
+        <w:rPr>
+          <w:rFonts w:ascii="Arial" w:hAnsi="Arial" w:cs="Arial"/>
+          <w:sz w:val="16"/>
+          <w:szCs w:val="16"/>
+        </w:rPr>
+        <w:t>EMAIL:</w:t>
+      </w:r>
+      <w:r>
+        <w:rPr>
+          <w:rFonts w:ascii="Arial" w:hAnsi="Arial" w:cs="Arial"/>
+          <w:sz w:val="16"/>
+          <w:szCs w:val="16"/>
+          <w:u w:val="single"/>
+        </w:rPr>
+        <w:t xml:space="preserve"> </w:t>
+      </w:r>
+      <w:sdt>
+        <w:sdtPr>
+          <w:rPr>
+            <w:rFonts w:ascii="Arial" w:hAnsi="Arial" w:cs="Arial"/>
+            <w:sz w:val="16"/>
+            <w:szCs w:val="16"/>
+            <w:u w:val="single"/>
+          </w:rPr>
+          <w:id w:val="-1414858657"/>
+          <w:placeholder>
+            <w:docPart w:val="8F6BAFD311C94E61A000B1378EE054CF"/>
+          </w:placeholder>
+          <w:text/>
+        </w:sdtPr>
+        <w:sdtContent>
+          <w:r>
+            <w:rPr>
+              <w:rFonts w:ascii="Arial" w:hAnsi="Arial" w:cs="Arial"/>
+              <w:sz w:val="16"/>
+              <w:szCs w:val="16"/>
+              <w:u w:val="single"/>
+            </w:rPr>
+            <w:t xml:space="preserve">{{ </w:t>
+          </w:r>
+          <w:proofErr w:type="spellStart"/>
+          <w:r>
+            <w:rPr>
+              <w:rFonts w:ascii="Arial" w:hAnsi="Arial" w:cs="Arial"/>
+              <w:sz w:val="16"/>
+              <w:szCs w:val="16"/>
+              <w:u w:val="single"/>
+            </w:rPr>
+            <w:t>supervisor_</w:t>
+          </w:r>
+          <w:r>
+            <w:rPr>
+              <w:rFonts w:ascii="Arial" w:hAnsi="Arial" w:cs="Arial"/>
+              <w:sz w:val="16"/>
+              <w:szCs w:val="16"/>
+              <w:u w:val="single"/>
+            </w:rPr>
+            <w:t>email</w:t>
+          </w:r>
+          <w:proofErr w:type="spellEnd"/>
+          <w:r>
+            <w:rPr>
+              <w:rFonts w:ascii="Arial" w:hAnsi="Arial" w:cs="Arial"/>
+              <w:sz w:val="16"/>
+              <w:szCs w:val="16"/>
+              <w:u w:val="single"/>
+            </w:rPr>
+            <w:t xml:space="preserve"> }}</w:t>
+          </w:r>
+        </w:sdtContent>
+      </w:sdt>
+      <w:r>
+        <w:rPr>
+          <w:szCs w:val="16"/>
+          <w:u w:val="single"/>
+        </w:rPr>
+        <w:tab/>
+      </w:r>
+      <w:r>
+        <w:rPr>
+          <w:szCs w:val="16"/>
+        </w:rPr>
+        <w:tab/>
+      </w:r>
+      <w:r>
+        <w:rPr>
+          <w:szCs w:val="16"/>
+        </w:rPr>
+        <w:t>GRIEVANTS UID (</w:t>
+      </w:r>
+      <w:r>
+        <w:rPr>
+          <w:szCs w:val="16"/>
+        </w:rPr>
+        <w:t>If applicable</w:t>
+      </w:r>
+      <w:r>
+        <w:rPr>
+          <w:szCs w:val="16"/>
+        </w:rPr>
+        <w:t>) :</w:t>
+      </w:r>
+      <w:r>
+        <w:rPr>
+          <w:rFonts w:ascii="Arial" w:hAnsi="Arial" w:cs="Arial"/>
+          <w:sz w:val="16"/>
+          <w:szCs w:val="16"/>
+          <w:u w:val="single"/>
+        </w:rPr>
+        <w:t xml:space="preserve"> </w:t>
+      </w:r>
+      <w:sdt>
+        <w:sdtPr>
+          <w:rPr>
+            <w:rFonts w:ascii="Arial" w:hAnsi="Arial" w:cs="Arial"/>
+            <w:sz w:val="16"/>
+            <w:szCs w:val="16"/>
+            <w:u w:val="single"/>
+          </w:rPr>
+          <w:id w:val="-449474558"/>
+          <w:placeholder>
+            <w:docPart w:val="DefaultPlaceholder_-1854013440"/>
+          </w:placeholder>
+          <w:text/>
+        </w:sdtPr>
+        <w:sdtContent>
+          <w:r>
+            <w:rPr>
+              <w:rFonts w:ascii="Arial" w:hAnsi="Arial" w:cs="Arial"/>
+              <w:sz w:val="16"/>
+              <w:szCs w:val="16"/>
+              <w:u w:val="single"/>
+            </w:rPr>
+            <w:t>{{</w:t>
+          </w:r>
+          <w:proofErr w:type="spellStart"/>
+          <w:r>
+            <w:rPr>
+              <w:rFonts w:ascii="Arial" w:hAnsi="Arial" w:cs="Arial"/>
+              <w:sz w:val="16"/>
+              <w:szCs w:val="16"/>
+              <w:u w:val="single"/>
+            </w:rPr>
+            <w:t>grievants</w:t>
+          </w:r>
+          <w:proofErr w:type="spellEnd"/>
+          <w:r>
+            <w:rPr>
+              <w:rFonts w:ascii="Arial" w:hAnsi="Arial" w:cs="Arial"/>
+              <w:sz w:val="16"/>
+              <w:szCs w:val="16"/>
+              <w:u w:val="single"/>
+            </w:rPr>
+            <w:t xml:space="preserve"> </w:t>
+          </w:r>
+          <w:proofErr w:type="spellStart"/>
+          <w:r>
+            <w:rPr>
+              <w:rFonts w:ascii="Arial" w:hAnsi="Arial" w:cs="Arial"/>
+              <w:sz w:val="16"/>
+              <w:szCs w:val="16"/>
+              <w:u w:val="single"/>
+            </w:rPr>
+            <w:t>uid</w:t>
+          </w:r>
+          <w:proofErr w:type="spellEnd"/>
+          <w:r>
+            <w:rPr>
+              <w:rFonts w:ascii="Arial" w:hAnsi="Arial" w:cs="Arial"/>
+              <w:sz w:val="16"/>
+              <w:szCs w:val="16"/>
+              <w:u w:val="single"/>
+            </w:rPr>
+            <w:t>}}</w:t>
+          </w:r>
+        </w:sdtContent>
+      </w:sdt>
+      <w:r>
+        <w:rPr>
+          <w:rFonts w:ascii="Arial" w:hAnsi="Arial" w:cs="Arial"/>
+          <w:sz w:val="16"/>
+          <w:szCs w:val="16"/>
+          <w:u w:val="single"/>
+        </w:rPr>
+        <w:tab/>
+      </w:r>
+      <w:r>
+        <w:rPr>
+          <w:rFonts w:ascii="Arial" w:hAnsi="Arial" w:cs="Arial"/>
+          <w:sz w:val="16"/>
+          <w:szCs w:val="16"/>
         </w:rPr>
         <w:tab/>
       </w:r>
@@ -1342,9 +1729,18 @@
           </w:placeholder>
           <w:text/>
         </w:sdtPr>
+        <w:sdtEndPr/>
         <w:sdtContent>
           <w:r>
-            <w:t>{{ incident_date }}</w:t>
+            <w:t xml:space="preserve">{{ </w:t>
+          </w:r>
+          <w:proofErr w:type="spellStart"/>
+          <w:r>
+            <w:t>incident_date</w:t>
+          </w:r>
+          <w:proofErr w:type="spellEnd"/>
+          <w:r>
+            <w:t xml:space="preserve"> }}</w:t>
           </w:r>
         </w:sdtContent>
       </w:sdt>
@@ -1426,6 +1822,7 @@
           </w:placeholder>
           <w:text/>
         </w:sdtPr>
+        <w:sdtEndPr/>
         <w:sdtContent>
           <w:r>
             <w:t>{{ article }}</w:t>
@@ -1633,6 +2030,7 @@
           </w:placeholder>
           <w:text w:multiLine="1"/>
         </w:sdtPr>
+        <w:sdtEndPr/>
         <w:sdtContent>
           <w:r>
             <w:rPr>
@@ -2122,6 +2520,7 @@
           </w:placeholder>
           <w:text/>
         </w:sdtPr>
+        <w:sdtEndPr/>
         <w:sdtContent>
           <w:r>
             <w:rPr>
@@ -2179,6 +2578,7 @@
           </w:placeholder>
           <w:text/>
         </w:sdtPr>
+        <w:sdtEndPr/>
         <w:sdtContent>
           <w:r>
             <w:rPr>
@@ -2241,6 +2641,7 @@
           <w:sz w:val="16"/>
           <w:szCs w:val="15"/>
         </w:rPr>
+        <w:lastRenderedPageBreak/>
         <w:t>SIGNED GRIEVANT</w:t>
       </w:r>
       <w:r>
@@ -2274,6 +2675,7 @@
           </w:placeholder>
           <w:text/>
         </w:sdtPr>
+        <w:sdtEndPr/>
         <w:sdtContent>
           <w:r>
             <w:rPr>
@@ -2339,6 +2741,7 @@
           </w:placeholder>
           <w:text/>
         </w:sdtPr>
+        <w:sdtEndPr/>
         <w:sdtContent>
           <w:r>
             <w:rPr>
@@ -2375,7 +2778,6 @@
           <w:sz w:val="16"/>
           <w:szCs w:val="15"/>
         </w:rPr>
-        <w:lastRenderedPageBreak/>
         <w:t xml:space="preserve"> </w:t>
       </w:r>
       <w:r>
@@ -2384,7 +2786,25 @@
           <w:sz w:val="16"/>
           <w:szCs w:val="15"/>
         </w:rPr>
-        <w:t>(Continuation of Grievant's Statement)</w:t>
+        <w:t xml:space="preserve">(Continuation of </w:t>
+      </w:r>
+      <w:proofErr w:type="spellStart"/>
+      <w:r>
+        <w:rPr>
+          <w:rFonts w:ascii="Arial" w:hAnsi="Arial" w:cs="Arial"/>
+          <w:sz w:val="16"/>
+          <w:szCs w:val="15"/>
+        </w:rPr>
+        <w:t>Grievant's</w:t>
+      </w:r>
+      <w:proofErr w:type="spellEnd"/>
+      <w:r>
+        <w:rPr>
+          <w:rFonts w:ascii="Arial" w:hAnsi="Arial" w:cs="Arial"/>
+          <w:sz w:val="16"/>
+          <w:szCs w:val="15"/>
+        </w:rPr>
+        <w:t xml:space="preserve"> Statement)</w:t>
       </w:r>
     </w:p>
     <w:p>
@@ -2425,6 +2845,7 @@
           </w:placeholder>
           <w:text w:multiLine="1"/>
         </w:sdtPr>
+        <w:sdtEndPr/>
         <w:sdtContent>
           <w:r>
             <w:rPr>
@@ -2936,6 +3357,7 @@
           </w:placeholder>
           <w:text/>
         </w:sdtPr>
+        <w:sdtEndPr/>
         <w:sdtContent>
           <w:r>
             <w:rPr>
@@ -3008,6 +3430,7 @@
           </w:placeholder>
           <w:text/>
         </w:sdtPr>
+        <w:sdtEndPr/>
         <w:sdtContent>
           <w:r>
             <w:rPr>
@@ -3088,6 +3511,7 @@
           </w:placeholder>
           <w:text/>
         </w:sdtPr>
+        <w:sdtEndPr/>
         <w:sdtContent>
           <w:r>
             <w:t>{{ witness_1_name }}</w:t>
@@ -3140,6 +3564,7 @@
           </w:placeholder>
           <w:text/>
         </w:sdtPr>
+        <w:sdtEndPr/>
         <w:sdtContent>
           <w:r>
             <w:t>{{ witness_1_title }}</w:t>
@@ -3200,6 +3625,7 @@
           </w:placeholder>
           <w:text/>
         </w:sdtPr>
+        <w:sdtEndPr/>
         <w:sdtContent>
           <w:r>
             <w:rPr>
@@ -3271,6 +3697,7 @@
           </w:placeholder>
           <w:text/>
         </w:sdtPr>
+        <w:sdtEndPr/>
         <w:sdtContent>
           <w:r>
             <w:rPr>
@@ -3353,6 +3780,7 @@
           </w:placeholder>
           <w:text/>
         </w:sdtPr>
+        <w:sdtEndPr/>
         <w:sdtContent>
           <w:r>
             <w:rPr>
@@ -3437,6 +3865,7 @@
           </w:placeholder>
           <w:text/>
         </w:sdtPr>
+        <w:sdtEndPr/>
         <w:sdtContent>
           <w:r>
             <w:rPr>
@@ -3526,6 +3955,7 @@
           </w:placeholder>
           <w:text/>
         </w:sdtPr>
+        <w:sdtEndPr/>
         <w:sdtContent>
           <w:r>
             <w:rPr>
@@ -3608,6 +4038,7 @@
           </w:placeholder>
           <w:text/>
         </w:sdtPr>
+        <w:sdtEndPr/>
         <w:sdtContent>
           <w:r>
             <w:rPr>
@@ -3692,6 +4123,7 @@
           </w:placeholder>
           <w:text/>
         </w:sdtPr>
+        <w:sdtEndPr/>
         <w:sdtContent>
           <w:r>
             <w:rPr>
@@ -4021,6 +4453,7 @@
       </w:placeholder>
       <w:text/>
     </w:sdtPr>
+    <w:sdtEndPr/>
     <w:sdtContent>
       <w:p>
         <w:pPr>
@@ -4028,7 +4461,15 @@
           <w:ind w:left="540"/>
         </w:pPr>
         <w:r>
-          <w:t>{{ grievance_number }}</w:t>
+          <w:t xml:space="preserve">{{ </w:t>
+        </w:r>
+        <w:proofErr w:type="spellStart"/>
+        <w:r>
+          <w:t>grievance_number</w:t>
+        </w:r>
+        <w:proofErr w:type="spellEnd"/>
+        <w:r>
+          <w:t xml:space="preserve"> }}</w:t>
         </w:r>
       </w:p>
     </w:sdtContent>
@@ -4499,7 +4940,6 @@
   <w:style w:type="character" w:default="1" w:styleId="DefaultParagraphFont">
     <w:name w:val="Default Paragraph Font"/>
     <w:uiPriority w:val="1"/>
-    <w:semiHidden/>
     <w:unhideWhenUsed/>
   </w:style>
   <w:style w:type="table" w:default="1" w:styleId="TableNormal">
@@ -4667,6 +5107,35 @@
         </w:p>
       </w:docPartBody>
     </w:docPart>
+    <w:docPart>
+      <w:docPartPr>
+        <w:name w:val="8F6BAFD311C94E61A000B1378EE054CF"/>
+        <w:category>
+          <w:name w:val="General"/>
+          <w:gallery w:val="placeholder"/>
+        </w:category>
+        <w:types>
+          <w:type w:val="bbPlcHdr"/>
+        </w:types>
+        <w:behaviors>
+          <w:behavior w:val="content"/>
+        </w:behaviors>
+        <w:guid w:val="{B2008018-3CEA-44FE-8C76-C809731C55B7}"/>
+      </w:docPartPr>
+      <w:docPartBody>
+        <w:p>
+          <w:pPr>
+            <w:pStyle w:val="8F6BAFD311C94E61A000B1378EE054CF"/>
+          </w:pPr>
+          <w:r>
+            <w:rPr>
+              <w:rStyle w:val="PlaceholderText"/>
+            </w:rPr>
+            <w:t>Click or tap here to enter text.</w:t>
+          </w:r>
+        </w:p>
+      </w:docPartBody>
+    </w:docPart>
   </w:docParts>
 </w:glossaryDocument>
 </file>
@@ -4695,7 +5164,6 @@
     <w:sig w:usb0="E4002EFF" w:usb1="C000E47F" w:usb2="00000009" w:usb3="00000000" w:csb0="000001FF" w:csb1="00000000"/>
   </w:font>
   <w:font w:name="Arial Black">
-    <w:altName w:val="Arial Black"/>
     <w:panose1 w:val="020B0A04020102020204"/>
     <w:charset w:val="00"/>
     <w:family w:val="swiss"/>
@@ -4747,14 +5215,17 @@
   </w:compat>
   <w:rsids>
     <w:rsidRoot w:val="00D604EF"/>
+    <w:rsid w:val="00033A73"/>
     <w:rsid w:val="000C3F22"/>
     <w:rsid w:val="001A0E6E"/>
     <w:rsid w:val="00241F08"/>
+    <w:rsid w:val="00297F2B"/>
     <w:rsid w:val="0077033A"/>
     <w:rsid w:val="00817D51"/>
     <w:rsid w:val="008C321A"/>
     <w:rsid w:val="00AD309B"/>
     <w:rsid w:val="00AD4204"/>
+    <w:rsid w:val="00C16BAF"/>
     <w:rsid w:val="00C732AD"/>
     <w:rsid w:val="00D604EF"/>
   </w:rsids>
@@ -5212,10 +5683,18 @@
     <w:basedOn w:val="DefaultParagraphFont"/>
     <w:uiPriority w:val="99"/>
     <w:semiHidden/>
-    <w:rsid w:val="00D604EF"/>
+    <w:rsid w:val="00297F2B"/>
     <w:rPr>
       <w:color w:val="808080"/>
     </w:rPr>
+  </w:style>
+  <w:style w:type="paragraph" w:customStyle="1" w:styleId="8F6BAFD311C94E61A000B1378EE054CF">
+    <w:name w:val="8F6BAFD311C94E61A000B1378EE054CF"/>
+    <w:rsid w:val="00297F2B"/>
+  </w:style>
+  <w:style w:type="paragraph" w:customStyle="1" w:styleId="D074C00AD9BF4735B017AB9207A6E29D">
+    <w:name w:val="D074C00AD9BF4735B017AB9207A6E29D"/>
+    <w:rsid w:val="00297F2B"/>
   </w:style>
 </w:styles>
 </file>
@@ -5523,32 +6002,8 @@
 </file>
 
 <file path=customXml/item1.xml><?xml version="1.0" encoding="utf-8"?>
-<b:Sources xmlns:b="http://schemas.openxmlformats.org/officeDocument/2006/bibliography" xmlns="http://schemas.openxmlformats.org/officeDocument/2006/bibliography" SelectedStyle="\APA.XSL" StyleName="APA"/>
-</file>
-
-<file path=customXml/item2.xml><?xml version="1.0" encoding="utf-8"?>
-<p:properties xmlns:p="http://schemas.microsoft.com/office/2006/metadata/properties" xmlns:xsi="http://www.w3.org/2001/XMLSchema-instance" xmlns:pc="http://schemas.microsoft.com/office/infopath/2007/PartnerControls">
-  <documentManagement>
-    <lcf76f155ced4ddcb4097134ff3c332f xmlns="673794e9-3e19-4007-a364-455a6c6973fe">
-      <Terms xmlns="http://schemas.microsoft.com/office/infopath/2007/PartnerControls"/>
-    </lcf76f155ced4ddcb4097134ff3c332f>
-    <TaxCatchAll xmlns="554fa842-296b-4ff3-a9f0-caf1751b1dc3" xsi:nil="true"/>
-  </documentManagement>
-</p:properties>
-</file>
-
-<file path=customXml/item3.xml><?xml version="1.0" encoding="utf-8"?>
-<?mso-contentType ?>
-<FormTemplates xmlns="http://schemas.microsoft.com/sharepoint/v3/contenttype/forms">
-  <Display>DocumentLibraryForm</Display>
-  <Edit>DocumentLibraryForm</Edit>
-  <New>DocumentLibraryForm</New>
-</FormTemplates>
-</file>
-
-<file path=customXml/item4.xml><?xml version="1.0" encoding="utf-8"?>
-<ct:contentTypeSchema xmlns:ct="http://schemas.microsoft.com/office/2006/metadata/contentType" xmlns:ma="http://schemas.microsoft.com/office/2006/metadata/properties/metaAttributes" ct:_="" ma:_="" ma:contentTypeName="Document" ma:contentTypeID="0x01010088F3A6D87D157F4F881C97413D39108F" ma:contentTypeVersion="12" ma:contentTypeDescription="Create a new document." ma:contentTypeScope="" ma:versionID="d142c28c2bb31ca565eeaadc292e1038">
-  <xsd:schema xmlns:xsd="http://www.w3.org/2001/XMLSchema" xmlns:xs="http://www.w3.org/2001/XMLSchema" xmlns:p="http://schemas.microsoft.com/office/2006/metadata/properties" xmlns:ns2="673794e9-3e19-4007-a364-455a6c6973fe" xmlns:ns3="554fa842-296b-4ff3-a9f0-caf1751b1dc3" targetNamespace="http://schemas.microsoft.com/office/2006/metadata/properties" ma:root="true" ma:fieldsID="b15ca51257deb7744b4d39bdfae0ef2e" ns2:_="" ns3:_="">
+<ct:contentTypeSchema xmlns:ct="http://schemas.microsoft.com/office/2006/metadata/contentType" xmlns:ma="http://schemas.microsoft.com/office/2006/metadata/properties/metaAttributes" ct:_="" ma:_="" ma:contentTypeName="Document" ma:contentTypeID="0x01010088F3A6D87D157F4F881C97413D39108F" ma:contentTypeVersion="12" ma:contentTypeDescription="Create a new document." ma:contentTypeScope="" ma:versionID="2736a01608bbe45f7b83c8188fe8ada0">
+  <xsd:schema xmlns:xsd="http://www.w3.org/2001/XMLSchema" xmlns:xs="http://www.w3.org/2001/XMLSchema" xmlns:p="http://schemas.microsoft.com/office/2006/metadata/properties" xmlns:ns2="673794e9-3e19-4007-a364-455a6c6973fe" xmlns:ns3="554fa842-296b-4ff3-a9f0-caf1751b1dc3" targetNamespace="http://schemas.microsoft.com/office/2006/metadata/properties" ma:root="true" ma:fieldsID="2e23588781261b5e543299c861e74e84" ns2:_="" ns3:_="">
     <xsd:import namespace="673794e9-3e19-4007-a364-455a6c6973fe"/>
     <xsd:import namespace="554fa842-296b-4ff3-a9f0-caf1751b1dc3"/>
     <xsd:element name="properties">
@@ -5747,15 +6202,43 @@
 </ct:contentTypeSchema>
 </file>
 
+<file path=customXml/item2.xml><?xml version="1.0" encoding="utf-8"?>
+<?mso-contentType ?>
+<FormTemplates xmlns="http://schemas.microsoft.com/sharepoint/v3/contenttype/forms">
+  <Display>DocumentLibraryForm</Display>
+  <Edit>DocumentLibraryForm</Edit>
+  <New>DocumentLibraryForm</New>
+</FormTemplates>
+</file>
+
+<file path=customXml/item3.xml><?xml version="1.0" encoding="utf-8"?>
+<p:properties xmlns:p="http://schemas.microsoft.com/office/2006/metadata/properties" xmlns:xsi="http://www.w3.org/2001/XMLSchema-instance" xmlns:pc="http://schemas.microsoft.com/office/infopath/2007/PartnerControls">
+  <documentManagement>
+    <lcf76f155ced4ddcb4097134ff3c332f xmlns="673794e9-3e19-4007-a364-455a6c6973fe">
+      <Terms xmlns="http://schemas.microsoft.com/office/infopath/2007/PartnerControls"/>
+    </lcf76f155ced4ddcb4097134ff3c332f>
+    <TaxCatchAll xmlns="554fa842-296b-4ff3-a9f0-caf1751b1dc3" xsi:nil="true"/>
+  </documentManagement>
+</p:properties>
+</file>
+
+<file path=customXml/item4.xml><?xml version="1.0" encoding="utf-8"?>
+<b:Sources xmlns:b="http://schemas.openxmlformats.org/officeDocument/2006/bibliography" xmlns="http://schemas.openxmlformats.org/officeDocument/2006/bibliography" SelectedStyle="\APA.XSL" StyleName="APA"/>
+</file>
+
 <file path=customXml/itemProps1.xml><?xml version="1.0" encoding="utf-8"?>
-<ds:datastoreItem xmlns:ds="http://schemas.openxmlformats.org/officeDocument/2006/customXml" ds:itemID="{DFDC2CFE-2515-496F-9DF2-20827740EEDB}">
+<ds:datastoreItem xmlns:ds="http://schemas.openxmlformats.org/officeDocument/2006/customXml" ds:itemID="{7AB835B2-661E-4135-BF68-654F03CA68EC}"/>
+</file>
+
+<file path=customXml/itemProps2.xml><?xml version="1.0" encoding="utf-8"?>
+<ds:datastoreItem xmlns:ds="http://schemas.openxmlformats.org/officeDocument/2006/customXml" ds:itemID="{A0FB17BC-837E-4162-A589-999F90C6EB61}">
   <ds:schemaRefs>
-    <ds:schemaRef ds:uri="http://schemas.openxmlformats.org/officeDocument/2006/bibliography"/>
+    <ds:schemaRef ds:uri="http://schemas.microsoft.com/sharepoint/v3/contenttype/forms"/>
   </ds:schemaRefs>
 </ds:datastoreItem>
 </file>
 
-<file path=customXml/itemProps2.xml><?xml version="1.0" encoding="utf-8"?>
+<file path=customXml/itemProps3.xml><?xml version="1.0" encoding="utf-8"?>
 <ds:datastoreItem xmlns:ds="http://schemas.openxmlformats.org/officeDocument/2006/customXml" ds:itemID="{E6B0A06A-B3CC-48A1-918B-3492EBC1FA47}">
   <ds:schemaRefs>
     <ds:schemaRef ds:uri="http://schemas.microsoft.com/office/2006/metadata/properties"/>
@@ -5766,29 +6249,10 @@
 </ds:datastoreItem>
 </file>
 
-<file path=customXml/itemProps3.xml><?xml version="1.0" encoding="utf-8"?>
-<ds:datastoreItem xmlns:ds="http://schemas.openxmlformats.org/officeDocument/2006/customXml" ds:itemID="{A0FB17BC-837E-4162-A589-999F90C6EB61}">
+<file path=customXml/itemProps4.xml><?xml version="1.0" encoding="utf-8"?>
+<ds:datastoreItem xmlns:ds="http://schemas.openxmlformats.org/officeDocument/2006/customXml" ds:itemID="{DFDC2CFE-2515-496F-9DF2-20827740EEDB}">
   <ds:schemaRefs>
-    <ds:schemaRef ds:uri="http://schemas.microsoft.com/sharepoint/v3/contenttype/forms"/>
-  </ds:schemaRefs>
-</ds:datastoreItem>
-</file>
-
-<file path=customXml/itemProps4.xml><?xml version="1.0" encoding="utf-8"?>
-<ds:datastoreItem xmlns:ds="http://schemas.openxmlformats.org/officeDocument/2006/customXml" ds:itemID="{E3DE5AC9-FC11-44CD-8E3A-B1BF40395CCF}">
-  <ds:schemaRefs>
-    <ds:schemaRef ds:uri="http://schemas.microsoft.com/office/2006/metadata/contentType"/>
-    <ds:schemaRef ds:uri="http://schemas.microsoft.com/office/2006/metadata/properties/metaAttributes"/>
-    <ds:schemaRef ds:uri="http://www.w3.org/2001/XMLSchema"/>
-    <ds:schemaRef ds:uri="http://schemas.microsoft.com/office/2006/metadata/properties"/>
-    <ds:schemaRef ds:uri="673794e9-3e19-4007-a364-455a6c6973fe"/>
-    <ds:schemaRef ds:uri="554fa842-296b-4ff3-a9f0-caf1751b1dc3"/>
-    <ds:schemaRef ds:uri="http://schemas.microsoft.com/office/2006/documentManagement/types"/>
-    <ds:schemaRef ds:uri="http://schemas.microsoft.com/office/infopath/2007/PartnerControls"/>
-    <ds:schemaRef ds:uri="http://schemas.openxmlformats.org/package/2006/metadata/core-properties"/>
-    <ds:schemaRef ds:uri="http://purl.org/dc/elements/1.1/"/>
-    <ds:schemaRef ds:uri="http://purl.org/dc/terms/"/>
-    <ds:schemaRef ds:uri="http://schemas.microsoft.com/internal/obd"/>
+    <ds:schemaRef ds:uri="http://schemas.openxmlformats.org/officeDocument/2006/bibliography"/>
   </ds:schemaRefs>
 </ds:datastoreItem>
 </file>
</xml_diff>